<commit_message>
Checkpoint: Actualización con carga visible de tres plantillas DOCX, rango escrito de expedientes, selección independiente de expediente, relación de Yo/padre/madre/padrinos y cuatro variables de abuelos, grupos de dos líneas para padres y padrinos, detección de marcadores y vista de correspondencias, respaldos locales y plantillas de prueba regeneradas.
</commit_message>
<xml_diff>
--- a/sample-templates/plantilla-prueba-1.docx
+++ b/sample-templates/plantilla-prueba-1.docx
@@ -32,22 +32,22 @@
     </w:p>
     <w:p>
       <w:r>
-        <w:t xml:space="preserve">Abuelos maternos:</w:t>
+        <w:t xml:space="preserve">Abuelo paterno: {abuelo_paterno}</w:t>
       </w:r>
     </w:p>
     <w:p>
       <w:r>
-        <w:t xml:space="preserve">{abuelos_maternos}</w:t>
+        <w:t xml:space="preserve">Abuela paterna: {abuela_paterna}</w:t>
       </w:r>
     </w:p>
     <w:p>
       <w:r>
-        <w:t xml:space="preserve">Abuelos paternos:</w:t>
+        <w:t xml:space="preserve">Abuelo materno: {abuelo_materno}</w:t>
       </w:r>
     </w:p>
     <w:p>
       <w:r>
-        <w:t xml:space="preserve">{abuelos_paternos}</w:t>
+        <w:t xml:space="preserve">Abuela materna: {abuela_materna}</w:t>
       </w:r>
     </w:p>
     <w:p>

</xml_diff>

<commit_message>
Checkpoint: Los usuarios ingresan únicamente dos nombres bajo padrinos; el parser acepta dos líneas o el separador E. Cada plantilla puede usar {el_sr} y {la_sra} por separado o {mis_padrinos} como bloque de dos líneas. Se regeneraron y validaron las plantillas DOCX de prueba, y el proyecto compila correctamente.
</commit_message>
<xml_diff>
--- a/sample-templates/plantilla-prueba-1.docx
+++ b/sample-templates/plantilla-prueba-1.docx
@@ -52,12 +52,12 @@
     </w:p>
     <w:p>
       <w:r>
-        <w:t xml:space="preserve">Padrino: {padrino_nombre}</w:t>
+        <w:t xml:space="preserve">El Sr. {el_sr}</w:t>
       </w:r>
     </w:p>
     <w:p>
       <w:r>
-        <w:t xml:space="preserve">Madrina: {madrina_nombre}</w:t>
+        <w:t xml:space="preserve">La Sra. {la_sra}</w:t>
       </w:r>
     </w:p>
     <w:sectPr/>

</xml_diff>